<commit_message>
Add V20 reference cushions and bounded pre-prototype evidence
Use published aftermarket dimensions without claiming a verified Sony mount. Record contact, hinge and tolerance risks, fresh saved-result audits, source screenshots and independent scalar comparisons. Update both illustrated reports and the small-sample purchase plan. Preserve the existing README artwork and clearly retain unvalidated product claims.
</commit_message>
<xml_diff>
--- a/SoftSpace Flex/reports/SoftSpace_Flex_Report.docx
+++ b/SoftSpace Flex/reports/SoftSpace_Flex_Report.docx
@@ -20,6 +20,11 @@
     </w:p>
     <w:p>
       <w:r>
+        <w:t>Current update on 21 October 2026: V20 adds three reference pad bodies from published aftermarket dimensions. Exact Sony mounting fit and the proposed pressure, sealing and sound benefits remain unverified. See the final V20 chapter for results and first sample purchases.</w:t>
+      </w:r>
+    </w:p>
+    <w:p>
+      <w:r>
         <w:t>We want a replacement cushion that presses less on glasses arms while keeping a good seal. The user keeps their headphone and replaces its removable pads. We are developing the contact idea together with our passive ear defender, but this is a separate product route.</w:t>
       </w:r>
     </w:p>
@@ -31,8 +36,8 @@
       <w:r>
         <w:drawing>
           <wp:inline xmlns:a="http://schemas.openxmlformats.org/drawingml/2006/main" xmlns:pic="http://schemas.openxmlformats.org/drawingml/2006/picture">
-            <wp:extent cx="5212080" cy="3310375"/>
-            <wp:docPr id="1" name="Picture 1" descr="Actual saved V8 adult replacement-pad CAD. The carrier is an interface blank, not a proven fit for a headphone brand. Surface triangles show the display mesh, not fabric texture."/>
+            <wp:extent cx="5989320" cy="2146173"/>
+            <wp:docPr id="1" name="Picture 1" descr="V20 uniform control and two soft-zone body candidates. Published aftermarket outside size; assumed opening and cover. The mounting skirt is not yet dimensioned or fit-verified."/>
             <wp:cNvGraphicFramePr>
               <a:graphicFrameLocks noChangeAspect="1"/>
             </wp:cNvGraphicFramePr>
@@ -40,7 +45,7 @@
               <a:graphicData uri="http://schemas.openxmlformats.org/drawingml/2006/picture">
                 <pic:pic>
                   <pic:nvPicPr>
-                    <pic:cNvPr id="0" name="pad.png"/>
+                    <pic:cNvPr id="0" name="V20_flex_CAD.png"/>
                     <pic:cNvPicPr/>
                   </pic:nvPicPr>
                   <pic:blipFill>
@@ -52,7 +57,7 @@
                   <pic:spPr>
                     <a:xfrm>
                       <a:off x="0" y="0"/>
-                      <a:ext cx="5212080" cy="3310375"/>
+                      <a:ext cx="5989320" cy="2146173"/>
                     </a:xfrm>
                     <a:prstGeom prst="rect"/>
                   </pic:spPr>
@@ -69,7 +74,7 @@
         <w:spacing w:after="200"/>
       </w:pPr>
       <w:r>
-        <w:t>Actual saved V8 adult replacement-pad CAD. The carrier is an interface blank, not a proven fit for a headphone brand. Surface triangles show the display mesh, not fabric texture.</w:t>
+        <w:t>V20 uniform control and two soft-zone body candidates. Published aftermarket outside size; assumed opening and cover. The mounting skirt is not yet dimensioned or fit-verified.</w:t>
       </w:r>
     </w:p>
     <w:p>
@@ -85,7 +90,7 @@
     </w:p>
     <w:p>
       <w:r>
-        <w:t>The shared standalone design is now V19. Its revised assembly and conditional joint calculations are recorded in the final chapters, including failed trials and refinement limits. The Sony WH CH720N pad remains generic pending original mounting measurements. No fit, comfort or sound benefit is proved.</w:t>
+        <w:t>The shared standalone design is now V19. Its revised assembly and conditional joint calculations are recorded in the final chapters, including failed trials and refinement limits. The new V20 pad bodies use a published aftermarket envelope, but exact Sony mounting dimensions are still missing. No fit, comfort or sound benefit is proved.</w:t>
       </w:r>
     </w:p>
     <w:p>
@@ -7908,7 +7913,7 @@
     </w:p>
     <w:p>
       <w:r>
-        <w:t>The generic V8 replacement pad is unchanged and is not claimed to fit Sony WH-CH720N. The user owns that headphone and will measure its mount later. Host fit, retention, incoming noise, outgoing playback, frequency response, ANC behaviour and wearer comfort remain untested. Both reports will be updated when those dimensions or results arrive.</w:t>
+        <w:t>The generic V8 replacement pad is unchanged and is not claimed to fit Sony WH-CH720N. At the V19 stage its mount had not been measured. The V20 chapter now uses a published aftermarket envelope and keeps the exact skirt and groove dimensions open. Host fit, retention, incoming noise, outgoing playback, frequency response, ANC behaviour and wearer comfort remain untested. Both reports will be updated when those dimensions or results arrive.</w:t>
       </w:r>
     </w:p>
     <w:p>
@@ -29473,6 +29478,1793 @@
         <w:t>The Sony WH CH720N replacement cushion is unchanged. No model-specific fit, pressure, sound isolation, playback leakage or ANC pass is added. Real pad and mounting measurements, material curves and fixture measurements remain the next inputs for both product routes.</w:t>
       </w:r>
     </w:p>
+    <w:p>
+      <w:r>
+        <w:br w:type="page"/>
+      </w:r>
+    </w:p>
+    <w:p>
+      <w:pPr>
+        <w:pStyle w:val="Heading1"/>
+      </w:pPr>
+      <w:r>
+        <w:t>V20 Internet dimensions and cushion candidates</w:t>
+      </w:r>
+    </w:p>
+    <w:p>
+      <w:r>
+        <w:t>Update on 21 October 2026. We can start buying small test samples, but both products remain unproven. SoftSpace keeps its V19 headphone design. SoftSpace Flex now has three V20 pad body candidates based on a published compatible-pad size. They are not yet fitted Sony replacement pads.</w:t>
+      </w:r>
+    </w:p>
+    <w:p>
+      <w:r>
+        <w:t>Brainwavz lists a WH CH720N compatible pad at 100 mm high, 80 mm wide and 30 mm thick. Sony confirms a groove attachment with top and bottom alignment features. Neither source gives us a complete mounting drawing. We did not measure the user headphone or infer exact dimensions from an unscaled picture.</w:t>
+      </w:r>
+    </w:p>
+    <w:p>
+      <w:pPr>
+        <w:keepNext/>
+        <w:jc w:val="center"/>
+      </w:pPr>
+      <w:r>
+        <w:drawing>
+          <wp:inline xmlns:a="http://schemas.openxmlformats.org/drawingml/2006/main" xmlns:pic="http://schemas.openxmlformats.org/drawingml/2006/picture">
+            <wp:extent cx="5989320" cy="2146173"/>
+            <wp:docPr id="27" name="Picture 27" descr="Actual saved V20 STEP surfaces. The two cutaways hide the cover to show different soft zones. The finished concept keeps a continuous cover. Colours identify parts, not selected material grades. Display triangles are not fabric texture."/>
+            <wp:cNvGraphicFramePr>
+              <a:graphicFrameLocks noChangeAspect="1"/>
+            </wp:cNvGraphicFramePr>
+            <a:graphic>
+              <a:graphicData uri="http://schemas.openxmlformats.org/drawingml/2006/picture">
+                <pic:pic>
+                  <pic:nvPicPr>
+                    <pic:cNvPr id="0" name="V20_flex_CAD.png"/>
+                    <pic:cNvPicPr/>
+                  </pic:nvPicPr>
+                  <pic:blipFill>
+                    <a:blip r:embed="rId11"/>
+                    <a:stretch>
+                      <a:fillRect/>
+                    </a:stretch>
+                  </pic:blipFill>
+                  <pic:spPr>
+                    <a:xfrm>
+                      <a:off x="0" y="0"/>
+                      <a:ext cx="5989320" cy="2146173"/>
+                    </a:xfrm>
+                    <a:prstGeom prst="rect"/>
+                  </pic:spPr>
+                </pic:pic>
+              </a:graphicData>
+            </a:graphic>
+          </wp:inline>
+        </w:drawing>
+      </w:r>
+    </w:p>
+    <w:p>
+      <w:pPr>
+        <w:pStyle w:val="Caption"/>
+        <w:spacing w:after="200"/>
+      </w:pPr>
+      <w:r>
+        <w:t>Actual saved V20 STEP surfaces. The two cutaways hide the cover to show different soft zones. The finished concept keeps a continuous cover. Colours identify parts, not selected material grades. Display triangles are not fabric texture.</w:t>
+      </w:r>
+    </w:p>
+    <w:tbl>
+      <w:tblPr>
+        <w:tblW w:type="auto" w:w="0"/>
+        <w:jc w:val="center"/>
+        <w:tblLayout w:type="fixed"/>
+        <w:tblLook w:firstColumn="1" w:firstRow="1" w:lastColumn="0" w:lastRow="0" w:noHBand="0" w:noVBand="1" w:val="04A0"/>
+      </w:tblPr>
+      <w:tblGrid>
+        <w:gridCol w:w="2376"/>
+        <w:gridCol w:w="7560"/>
+      </w:tblGrid>
+      <w:tr>
+        <w:trPr>
+          <w:tblHeader/>
+          <w:cantSplit/>
+        </w:trPr>
+        <w:tc>
+          <w:tcPr>
+            <w:tcW w:type="dxa" w:w="2376"/>
+            <w:vAlign w:val="center"/>
+            <w:shd w:fill="203E4B"/>
+            <w:tcMar>
+              <w:top w:w="90" w:type="dxa"/>
+              <w:left w:w="90" w:type="dxa"/>
+              <w:bottom w:w="90" w:type="dxa"/>
+              <w:right w:w="90" w:type="dxa"/>
+            </w:tcMar>
+            <w:tcBorders>
+              <w:top w:val="single" w:sz="4" w:color="D9D9D9"/>
+              <w:left w:val="single" w:sz="4" w:color="D9D9D9"/>
+              <w:bottom w:val="single" w:sz="4" w:color="D9D9D9"/>
+              <w:right w:val="single" w:sz="4" w:color="D9D9D9"/>
+            </w:tcBorders>
+          </w:tcPr>
+          <w:p>
+            <w:pPr>
+              <w:spacing w:after="40" w:line="259" w:lineRule="auto"/>
+            </w:pPr>
+            <w:r>
+              <w:rPr>
+                <w:b/>
+                <w:color w:val="FFFFFF"/>
+                <w:sz w:val="20"/>
+              </w:rPr>
+              <w:t>Input</w:t>
+            </w:r>
+          </w:p>
+        </w:tc>
+        <w:tc>
+          <w:tcPr>
+            <w:tcW w:type="dxa" w:w="7560"/>
+            <w:vAlign w:val="center"/>
+            <w:shd w:fill="203E4B"/>
+            <w:tcMar>
+              <w:top w:w="90" w:type="dxa"/>
+              <w:left w:w="90" w:type="dxa"/>
+              <w:bottom w:w="90" w:type="dxa"/>
+              <w:right w:w="90" w:type="dxa"/>
+            </w:tcMar>
+            <w:tcBorders>
+              <w:top w:val="single" w:sz="4" w:color="D9D9D9"/>
+              <w:left w:val="single" w:sz="4" w:color="D9D9D9"/>
+              <w:bottom w:val="single" w:sz="4" w:color="D9D9D9"/>
+              <w:right w:val="single" w:sz="4" w:color="D9D9D9"/>
+            </w:tcBorders>
+          </w:tcPr>
+          <w:p>
+            <w:pPr>
+              <w:spacing w:after="40" w:line="259" w:lineRule="auto"/>
+            </w:pPr>
+            <w:r>
+              <w:rPr>
+                <w:b/>
+                <w:color w:val="FFFFFF"/>
+                <w:sz w:val="20"/>
+              </w:rPr>
+              <w:t>Value and evidence</w:t>
+            </w:r>
+          </w:p>
+        </w:tc>
+      </w:tr>
+      <w:tr>
+        <w:trPr>
+          <w:cantSplit/>
+        </w:trPr>
+        <w:tc>
+          <w:tcPr>
+            <w:tcW w:type="dxa" w:w="2376"/>
+            <w:vAlign w:val="center"/>
+            <w:shd w:fill="F0F5F5"/>
+            <w:tcMar>
+              <w:top w:w="90" w:type="dxa"/>
+              <w:left w:w="90" w:type="dxa"/>
+              <w:bottom w:w="90" w:type="dxa"/>
+              <w:right w:w="90" w:type="dxa"/>
+            </w:tcMar>
+            <w:tcBorders>
+              <w:top w:val="single" w:sz="4" w:color="D9D9D9"/>
+              <w:left w:val="single" w:sz="4" w:color="D9D9D9"/>
+              <w:bottom w:val="single" w:sz="4" w:color="D9D9D9"/>
+              <w:right w:val="single" w:sz="4" w:color="D9D9D9"/>
+            </w:tcBorders>
+          </w:tcPr>
+          <w:p>
+            <w:pPr>
+              <w:spacing w:after="40" w:line="259" w:lineRule="auto"/>
+            </w:pPr>
+            <w:r>
+              <w:rPr>
+                <w:b w:val="0"/>
+                <w:color w:val="000000"/>
+                <w:sz w:val="20"/>
+              </w:rPr>
+              <w:t>Outside size</w:t>
+            </w:r>
+          </w:p>
+        </w:tc>
+        <w:tc>
+          <w:tcPr>
+            <w:tcW w:type="dxa" w:w="7560"/>
+            <w:vAlign w:val="center"/>
+            <w:shd w:fill="F0F5F5"/>
+            <w:tcMar>
+              <w:top w:w="90" w:type="dxa"/>
+              <w:left w:w="90" w:type="dxa"/>
+              <w:bottom w:w="90" w:type="dxa"/>
+              <w:right w:w="90" w:type="dxa"/>
+            </w:tcMar>
+            <w:tcBorders>
+              <w:top w:val="single" w:sz="4" w:color="D9D9D9"/>
+              <w:left w:val="single" w:sz="4" w:color="D9D9D9"/>
+              <w:bottom w:val="single" w:sz="4" w:color="D9D9D9"/>
+              <w:right w:val="single" w:sz="4" w:color="D9D9D9"/>
+            </w:tcBorders>
+          </w:tcPr>
+          <w:p>
+            <w:pPr>
+              <w:spacing w:after="40" w:line="259" w:lineRule="auto"/>
+            </w:pPr>
+            <w:r>
+              <w:rPr>
+                <w:b w:val="0"/>
+                <w:color w:val="000000"/>
+                <w:sz w:val="20"/>
+              </w:rPr>
+              <w:t>100 by 80 by 30 mm from an aftermarket pad maker, not a Sony OEM drawing</w:t>
+            </w:r>
+          </w:p>
+        </w:tc>
+      </w:tr>
+      <w:tr>
+        <w:trPr>
+          <w:cantSplit/>
+        </w:trPr>
+        <w:tc>
+          <w:tcPr>
+            <w:tcW w:type="dxa" w:w="2376"/>
+            <w:vAlign w:val="center"/>
+            <w:shd w:fill="FFFFFF"/>
+            <w:tcMar>
+              <w:top w:w="90" w:type="dxa"/>
+              <w:left w:w="90" w:type="dxa"/>
+              <w:bottom w:w="90" w:type="dxa"/>
+              <w:right w:w="90" w:type="dxa"/>
+            </w:tcMar>
+            <w:tcBorders>
+              <w:top w:val="single" w:sz="4" w:color="D9D9D9"/>
+              <w:left w:val="single" w:sz="4" w:color="D9D9D9"/>
+              <w:bottom w:val="single" w:sz="4" w:color="D9D9D9"/>
+              <w:right w:val="single" w:sz="4" w:color="D9D9D9"/>
+            </w:tcBorders>
+          </w:tcPr>
+          <w:p>
+            <w:pPr>
+              <w:spacing w:after="40" w:line="259" w:lineRule="auto"/>
+            </w:pPr>
+            <w:r>
+              <w:rPr>
+                <w:b w:val="0"/>
+                <w:color w:val="000000"/>
+                <w:sz w:val="20"/>
+              </w:rPr>
+              <w:t>Ear opening</w:t>
+            </w:r>
+          </w:p>
+        </w:tc>
+        <w:tc>
+          <w:tcPr>
+            <w:tcW w:type="dxa" w:w="7560"/>
+            <w:vAlign w:val="center"/>
+            <w:shd w:fill="FFFFFF"/>
+            <w:tcMar>
+              <w:top w:w="90" w:type="dxa"/>
+              <w:left w:w="90" w:type="dxa"/>
+              <w:bottom w:w="90" w:type="dxa"/>
+              <w:right w:w="90" w:type="dxa"/>
+            </w:tcMar>
+            <w:tcBorders>
+              <w:top w:val="single" w:sz="4" w:color="D9D9D9"/>
+              <w:left w:val="single" w:sz="4" w:color="D9D9D9"/>
+              <w:bottom w:val="single" w:sz="4" w:color="D9D9D9"/>
+              <w:right w:val="single" w:sz="4" w:color="D9D9D9"/>
+            </w:tcBorders>
+          </w:tcPr>
+          <w:p>
+            <w:pPr>
+              <w:spacing w:after="40" w:line="259" w:lineRule="auto"/>
+            </w:pPr>
+            <w:r>
+              <w:rPr>
+                <w:b w:val="0"/>
+                <w:color w:val="000000"/>
+                <w:sz w:val="20"/>
+              </w:rPr>
+              <w:t>50 by 70 mm assumed for the first comparison</w:t>
+            </w:r>
+          </w:p>
+        </w:tc>
+      </w:tr>
+      <w:tr>
+        <w:trPr>
+          <w:cantSplit/>
+        </w:trPr>
+        <w:tc>
+          <w:tcPr>
+            <w:tcW w:type="dxa" w:w="2376"/>
+            <w:vAlign w:val="center"/>
+            <w:shd w:fill="F0F5F5"/>
+            <w:tcMar>
+              <w:top w:w="90" w:type="dxa"/>
+              <w:left w:w="90" w:type="dxa"/>
+              <w:bottom w:w="90" w:type="dxa"/>
+              <w:right w:w="90" w:type="dxa"/>
+            </w:tcMar>
+            <w:tcBorders>
+              <w:top w:val="single" w:sz="4" w:color="D9D9D9"/>
+              <w:left w:val="single" w:sz="4" w:color="D9D9D9"/>
+              <w:bottom w:val="single" w:sz="4" w:color="D9D9D9"/>
+              <w:right w:val="single" w:sz="4" w:color="D9D9D9"/>
+            </w:tcBorders>
+          </w:tcPr>
+          <w:p>
+            <w:pPr>
+              <w:spacing w:after="40" w:line="259" w:lineRule="auto"/>
+            </w:pPr>
+            <w:r>
+              <w:rPr>
+                <w:b w:val="0"/>
+                <w:color w:val="000000"/>
+                <w:sz w:val="20"/>
+              </w:rPr>
+              <w:t>Cover thickness</w:t>
+            </w:r>
+          </w:p>
+        </w:tc>
+        <w:tc>
+          <w:tcPr>
+            <w:tcW w:type="dxa" w:w="7560"/>
+            <w:vAlign w:val="center"/>
+            <w:shd w:fill="F0F5F5"/>
+            <w:tcMar>
+              <w:top w:w="90" w:type="dxa"/>
+              <w:left w:w="90" w:type="dxa"/>
+              <w:bottom w:w="90" w:type="dxa"/>
+              <w:right w:w="90" w:type="dxa"/>
+            </w:tcMar>
+            <w:tcBorders>
+              <w:top w:val="single" w:sz="4" w:color="D9D9D9"/>
+              <w:left w:val="single" w:sz="4" w:color="D9D9D9"/>
+              <w:bottom w:val="single" w:sz="4" w:color="D9D9D9"/>
+              <w:right w:val="single" w:sz="4" w:color="D9D9D9"/>
+            </w:tcBorders>
+          </w:tcPr>
+          <w:p>
+            <w:pPr>
+              <w:spacing w:after="40" w:line="259" w:lineRule="auto"/>
+            </w:pPr>
+            <w:r>
+              <w:rPr>
+                <w:b w:val="0"/>
+                <w:color w:val="000000"/>
+                <w:sz w:val="20"/>
+              </w:rPr>
+              <w:t>0.35 mm assumed; actual cover stiffness and seam need samples</w:t>
+            </w:r>
+          </w:p>
+        </w:tc>
+      </w:tr>
+      <w:tr>
+        <w:trPr>
+          <w:cantSplit/>
+        </w:trPr>
+        <w:tc>
+          <w:tcPr>
+            <w:tcW w:type="dxa" w:w="2376"/>
+            <w:vAlign w:val="center"/>
+            <w:shd w:fill="FFFFFF"/>
+            <w:tcMar>
+              <w:top w:w="90" w:type="dxa"/>
+              <w:left w:w="90" w:type="dxa"/>
+              <w:bottom w:w="90" w:type="dxa"/>
+              <w:right w:w="90" w:type="dxa"/>
+            </w:tcMar>
+            <w:tcBorders>
+              <w:top w:val="single" w:sz="4" w:color="D9D9D9"/>
+              <w:left w:val="single" w:sz="4" w:color="D9D9D9"/>
+              <w:bottom w:val="single" w:sz="4" w:color="D9D9D9"/>
+              <w:right w:val="single" w:sz="4" w:color="D9D9D9"/>
+            </w:tcBorders>
+          </w:tcPr>
+          <w:p>
+            <w:pPr>
+              <w:spacing w:after="40" w:line="259" w:lineRule="auto"/>
+            </w:pPr>
+            <w:r>
+              <w:rPr>
+                <w:b w:val="0"/>
+                <w:color w:val="000000"/>
+                <w:sz w:val="20"/>
+              </w:rPr>
+              <w:t>Candidates</w:t>
+            </w:r>
+          </w:p>
+        </w:tc>
+        <w:tc>
+          <w:tcPr>
+            <w:tcW w:type="dxa" w:w="7560"/>
+            <w:vAlign w:val="center"/>
+            <w:shd w:fill="FFFFFF"/>
+            <w:tcMar>
+              <w:top w:w="90" w:type="dxa"/>
+              <w:left w:w="90" w:type="dxa"/>
+              <w:bottom w:w="90" w:type="dxa"/>
+              <w:right w:w="90" w:type="dxa"/>
+            </w:tcMar>
+            <w:tcBorders>
+              <w:top w:val="single" w:sz="4" w:color="D9D9D9"/>
+              <w:left w:val="single" w:sz="4" w:color="D9D9D9"/>
+              <w:bottom w:val="single" w:sz="4" w:color="D9D9D9"/>
+              <w:right w:val="single" w:sz="4" w:color="D9D9D9"/>
+            </w:tcBorders>
+          </w:tcPr>
+          <w:p>
+            <w:pPr>
+              <w:spacing w:after="40" w:line="259" w:lineRule="auto"/>
+            </w:pPr>
+            <w:r>
+              <w:rPr>
+                <w:b w:val="0"/>
+                <w:color w:val="000000"/>
+                <w:sz w:val="20"/>
+              </w:rPr>
+              <w:t>Uniform control, 18 mm soft zone and 32 mm soft zone</w:t>
+            </w:r>
+          </w:p>
+        </w:tc>
+      </w:tr>
+      <w:tr>
+        <w:trPr>
+          <w:cantSplit/>
+        </w:trPr>
+        <w:tc>
+          <w:tcPr>
+            <w:tcW w:type="dxa" w:w="2376"/>
+            <w:vAlign w:val="center"/>
+            <w:shd w:fill="F0F5F5"/>
+            <w:tcMar>
+              <w:top w:w="90" w:type="dxa"/>
+              <w:left w:w="90" w:type="dxa"/>
+              <w:bottom w:w="90" w:type="dxa"/>
+              <w:right w:w="90" w:type="dxa"/>
+            </w:tcMar>
+            <w:tcBorders>
+              <w:top w:val="single" w:sz="4" w:color="D9D9D9"/>
+              <w:left w:val="single" w:sz="4" w:color="D9D9D9"/>
+              <w:bottom w:val="single" w:sz="4" w:color="D9D9D9"/>
+              <w:right w:val="single" w:sz="4" w:color="D9D9D9"/>
+            </w:tcBorders>
+          </w:tcPr>
+          <w:p>
+            <w:pPr>
+              <w:spacing w:after="40" w:line="259" w:lineRule="auto"/>
+            </w:pPr>
+            <w:r>
+              <w:rPr>
+                <w:b w:val="0"/>
+                <w:color w:val="000000"/>
+                <w:sz w:val="20"/>
+              </w:rPr>
+              <w:t>Attachment</w:t>
+            </w:r>
+          </w:p>
+        </w:tc>
+        <w:tc>
+          <w:tcPr>
+            <w:tcW w:type="dxa" w:w="7560"/>
+            <w:vAlign w:val="center"/>
+            <w:shd w:fill="F0F5F5"/>
+            <w:tcMar>
+              <w:top w:w="90" w:type="dxa"/>
+              <w:left w:w="90" w:type="dxa"/>
+              <w:bottom w:w="90" w:type="dxa"/>
+              <w:right w:w="90" w:type="dxa"/>
+            </w:tcMar>
+            <w:tcBorders>
+              <w:top w:val="single" w:sz="4" w:color="D9D9D9"/>
+              <w:left w:val="single" w:sz="4" w:color="D9D9D9"/>
+              <w:bottom w:val="single" w:sz="4" w:color="D9D9D9"/>
+              <w:right w:val="single" w:sz="4" w:color="D9D9D9"/>
+            </w:tcBorders>
+          </w:tcPr>
+          <w:p>
+            <w:pPr>
+              <w:spacing w:after="40" w:line="259" w:lineRule="auto"/>
+            </w:pPr>
+            <w:r>
+              <w:rPr>
+                <w:b w:val="0"/>
+                <w:color w:val="000000"/>
+                <w:sz w:val="20"/>
+              </w:rPr>
+              <w:t>Groove approach verified in Sony instructions; exact skirt and groove dimensions remain unknown</w:t>
+            </w:r>
+          </w:p>
+        </w:tc>
+      </w:tr>
+    </w:tbl>
+    <w:p/>
+    <w:p>
+      <w:r>
+        <w:t>All three exported STEP bodies reimported with positive volumes and the expected part counts. This is a file and geometry check, not a mounting, sealing or comfort pass. The earlier generic V8 cushion remains in the history.</w:t>
+      </w:r>
+    </w:p>
+    <w:p>
+      <w:r>
+        <w:br w:type="page"/>
+      </w:r>
+    </w:p>
+    <w:p>
+      <w:pPr>
+        <w:pStyle w:val="Heading1"/>
+      </w:pPr>
+      <w:r>
+        <w:t>V20 What the cushion calculations show</w:t>
+      </w:r>
+    </w:p>
+    <w:p>
+      <w:r>
+        <w:t>We compared 11,664 paired cases with different assumed foam stiffness, cover stiffness, force, glasses thickness, position and zone size. This simple model treats areas of foam as separate compressible columns. It does not simulate a complete head, skin or real cover membrane.</w:t>
+      </w:r>
+    </w:p>
+    <w:tbl>
+      <w:tblPr>
+        <w:tblW w:type="auto" w:w="0"/>
+        <w:jc w:val="center"/>
+        <w:tblLayout w:type="fixed"/>
+        <w:tblLook w:firstColumn="1" w:firstRow="1" w:lastColumn="0" w:lastRow="0" w:noHBand="0" w:noVBand="1" w:val="04A0"/>
+      </w:tblPr>
+      <w:tblGrid>
+        <w:gridCol w:w="2016"/>
+        <w:gridCol w:w="1728"/>
+        <w:gridCol w:w="6192"/>
+      </w:tblGrid>
+      <w:tr>
+        <w:trPr>
+          <w:tblHeader/>
+          <w:cantSplit/>
+        </w:trPr>
+        <w:tc>
+          <w:tcPr>
+            <w:tcW w:type="dxa" w:w="2016"/>
+            <w:vAlign w:val="center"/>
+            <w:shd w:fill="203E4B"/>
+            <w:tcMar>
+              <w:top w:w="90" w:type="dxa"/>
+              <w:left w:w="90" w:type="dxa"/>
+              <w:bottom w:w="90" w:type="dxa"/>
+              <w:right w:w="90" w:type="dxa"/>
+            </w:tcMar>
+            <w:tcBorders>
+              <w:top w:val="single" w:sz="4" w:color="D9D9D9"/>
+              <w:left w:val="single" w:sz="4" w:color="D9D9D9"/>
+              <w:bottom w:val="single" w:sz="4" w:color="D9D9D9"/>
+              <w:right w:val="single" w:sz="4" w:color="D9D9D9"/>
+            </w:tcBorders>
+          </w:tcPr>
+          <w:p>
+            <w:pPr>
+              <w:spacing w:after="40" w:line="259" w:lineRule="auto"/>
+            </w:pPr>
+            <w:r>
+              <w:rPr>
+                <w:b/>
+                <w:color w:val="FFFFFF"/>
+                <w:sz w:val="20"/>
+              </w:rPr>
+              <w:t>Soft zone height</w:t>
+            </w:r>
+          </w:p>
+        </w:tc>
+        <w:tc>
+          <w:tcPr>
+            <w:tcW w:type="dxa" w:w="1728"/>
+            <w:vAlign w:val="center"/>
+            <w:shd w:fill="203E4B"/>
+            <w:tcMar>
+              <w:top w:w="90" w:type="dxa"/>
+              <w:left w:w="90" w:type="dxa"/>
+              <w:bottom w:w="90" w:type="dxa"/>
+              <w:right w:w="90" w:type="dxa"/>
+            </w:tcMar>
+            <w:tcBorders>
+              <w:top w:val="single" w:sz="4" w:color="D9D9D9"/>
+              <w:left w:val="single" w:sz="4" w:color="D9D9D9"/>
+              <w:bottom w:val="single" w:sz="4" w:color="D9D9D9"/>
+              <w:right w:val="single" w:sz="4" w:color="D9D9D9"/>
+            </w:tcBorders>
+          </w:tcPr>
+          <w:p>
+            <w:pPr>
+              <w:spacing w:after="40" w:line="259" w:lineRule="auto"/>
+            </w:pPr>
+            <w:r>
+              <w:rPr>
+                <w:b/>
+                <w:color w:val="FFFFFF"/>
+                <w:sz w:val="20"/>
+              </w:rPr>
+              <w:t>Paired cases</w:t>
+            </w:r>
+          </w:p>
+        </w:tc>
+        <w:tc>
+          <w:tcPr>
+            <w:tcW w:type="dxa" w:w="6192"/>
+            <w:vAlign w:val="center"/>
+            <w:shd w:fill="203E4B"/>
+            <w:tcMar>
+              <w:top w:w="90" w:type="dxa"/>
+              <w:left w:w="90" w:type="dxa"/>
+              <w:bottom w:w="90" w:type="dxa"/>
+              <w:right w:w="90" w:type="dxa"/>
+            </w:tcMar>
+            <w:tcBorders>
+              <w:top w:val="single" w:sz="4" w:color="D9D9D9"/>
+              <w:left w:val="single" w:sz="4" w:color="D9D9D9"/>
+              <w:bottom w:val="single" w:sz="4" w:color="D9D9D9"/>
+              <w:right w:val="single" w:sz="4" w:color="D9D9D9"/>
+            </w:tcBorders>
+          </w:tcPr>
+          <w:p>
+            <w:pPr>
+              <w:spacing w:after="40" w:line="259" w:lineRule="auto"/>
+            </w:pPr>
+            <w:r>
+              <w:rPr>
+                <w:b/>
+                <w:color w:val="FFFFFF"/>
+                <w:sz w:val="20"/>
+              </w:rPr>
+              <w:t>Cases with increased local pressure within the chosen compression screen</w:t>
+            </w:r>
+          </w:p>
+        </w:tc>
+      </w:tr>
+      <w:tr>
+        <w:trPr>
+          <w:cantSplit/>
+        </w:trPr>
+        <w:tc>
+          <w:tcPr>
+            <w:tcW w:type="dxa" w:w="2016"/>
+            <w:vAlign w:val="center"/>
+            <w:shd w:fill="F0F5F5"/>
+            <w:tcMar>
+              <w:top w:w="90" w:type="dxa"/>
+              <w:left w:w="90" w:type="dxa"/>
+              <w:bottom w:w="90" w:type="dxa"/>
+              <w:right w:w="90" w:type="dxa"/>
+            </w:tcMar>
+            <w:tcBorders>
+              <w:top w:val="single" w:sz="4" w:color="D9D9D9"/>
+              <w:left w:val="single" w:sz="4" w:color="D9D9D9"/>
+              <w:bottom w:val="single" w:sz="4" w:color="D9D9D9"/>
+              <w:right w:val="single" w:sz="4" w:color="D9D9D9"/>
+            </w:tcBorders>
+          </w:tcPr>
+          <w:p>
+            <w:pPr>
+              <w:spacing w:after="40" w:line="259" w:lineRule="auto"/>
+            </w:pPr>
+            <w:r>
+              <w:rPr>
+                <w:b w:val="0"/>
+                <w:color w:val="000000"/>
+                <w:sz w:val="20"/>
+              </w:rPr>
+              <w:t>12 mm</w:t>
+            </w:r>
+          </w:p>
+        </w:tc>
+        <w:tc>
+          <w:tcPr>
+            <w:tcW w:type="dxa" w:w="1728"/>
+            <w:vAlign w:val="center"/>
+            <w:shd w:fill="F0F5F5"/>
+            <w:tcMar>
+              <w:top w:w="90" w:type="dxa"/>
+              <w:left w:w="90" w:type="dxa"/>
+              <w:bottom w:w="90" w:type="dxa"/>
+              <w:right w:w="90" w:type="dxa"/>
+            </w:tcMar>
+            <w:tcBorders>
+              <w:top w:val="single" w:sz="4" w:color="D9D9D9"/>
+              <w:left w:val="single" w:sz="4" w:color="D9D9D9"/>
+              <w:bottom w:val="single" w:sz="4" w:color="D9D9D9"/>
+              <w:right w:val="single" w:sz="4" w:color="D9D9D9"/>
+            </w:tcBorders>
+          </w:tcPr>
+          <w:p>
+            <w:pPr>
+              <w:spacing w:after="40" w:line="259" w:lineRule="auto"/>
+            </w:pPr>
+            <w:r>
+              <w:rPr>
+                <w:b w:val="0"/>
+                <w:color w:val="000000"/>
+                <w:sz w:val="20"/>
+              </w:rPr>
+              <w:t>2916</w:t>
+            </w:r>
+          </w:p>
+        </w:tc>
+        <w:tc>
+          <w:tcPr>
+            <w:tcW w:type="dxa" w:w="6192"/>
+            <w:vAlign w:val="center"/>
+            <w:shd w:fill="F0F5F5"/>
+            <w:tcMar>
+              <w:top w:w="90" w:type="dxa"/>
+              <w:left w:w="90" w:type="dxa"/>
+              <w:bottom w:w="90" w:type="dxa"/>
+              <w:right w:w="90" w:type="dxa"/>
+            </w:tcMar>
+            <w:tcBorders>
+              <w:top w:val="single" w:sz="4" w:color="D9D9D9"/>
+              <w:left w:val="single" w:sz="4" w:color="D9D9D9"/>
+              <w:bottom w:val="single" w:sz="4" w:color="D9D9D9"/>
+              <w:right w:val="single" w:sz="4" w:color="D9D9D9"/>
+            </w:tcBorders>
+          </w:tcPr>
+          <w:p>
+            <w:pPr>
+              <w:spacing w:after="40" w:line="259" w:lineRule="auto"/>
+            </w:pPr>
+            <w:r>
+              <w:rPr>
+                <w:b w:val="0"/>
+                <w:color w:val="000000"/>
+                <w:sz w:val="20"/>
+              </w:rPr>
+              <w:t>624</w:t>
+            </w:r>
+          </w:p>
+        </w:tc>
+      </w:tr>
+      <w:tr>
+        <w:trPr>
+          <w:cantSplit/>
+        </w:trPr>
+        <w:tc>
+          <w:tcPr>
+            <w:tcW w:type="dxa" w:w="2016"/>
+            <w:vAlign w:val="center"/>
+            <w:shd w:fill="FFFFFF"/>
+            <w:tcMar>
+              <w:top w:w="90" w:type="dxa"/>
+              <w:left w:w="90" w:type="dxa"/>
+              <w:bottom w:w="90" w:type="dxa"/>
+              <w:right w:w="90" w:type="dxa"/>
+            </w:tcMar>
+            <w:tcBorders>
+              <w:top w:val="single" w:sz="4" w:color="D9D9D9"/>
+              <w:left w:val="single" w:sz="4" w:color="D9D9D9"/>
+              <w:bottom w:val="single" w:sz="4" w:color="D9D9D9"/>
+              <w:right w:val="single" w:sz="4" w:color="D9D9D9"/>
+            </w:tcBorders>
+          </w:tcPr>
+          <w:p>
+            <w:pPr>
+              <w:spacing w:after="40" w:line="259" w:lineRule="auto"/>
+            </w:pPr>
+            <w:r>
+              <w:rPr>
+                <w:b w:val="0"/>
+                <w:color w:val="000000"/>
+                <w:sz w:val="20"/>
+              </w:rPr>
+              <w:t>18 mm</w:t>
+            </w:r>
+          </w:p>
+        </w:tc>
+        <w:tc>
+          <w:tcPr>
+            <w:tcW w:type="dxa" w:w="1728"/>
+            <w:vAlign w:val="center"/>
+            <w:shd w:fill="FFFFFF"/>
+            <w:tcMar>
+              <w:top w:w="90" w:type="dxa"/>
+              <w:left w:w="90" w:type="dxa"/>
+              <w:bottom w:w="90" w:type="dxa"/>
+              <w:right w:w="90" w:type="dxa"/>
+            </w:tcMar>
+            <w:tcBorders>
+              <w:top w:val="single" w:sz="4" w:color="D9D9D9"/>
+              <w:left w:val="single" w:sz="4" w:color="D9D9D9"/>
+              <w:bottom w:val="single" w:sz="4" w:color="D9D9D9"/>
+              <w:right w:val="single" w:sz="4" w:color="D9D9D9"/>
+            </w:tcBorders>
+          </w:tcPr>
+          <w:p>
+            <w:pPr>
+              <w:spacing w:after="40" w:line="259" w:lineRule="auto"/>
+            </w:pPr>
+            <w:r>
+              <w:rPr>
+                <w:b w:val="0"/>
+                <w:color w:val="000000"/>
+                <w:sz w:val="20"/>
+              </w:rPr>
+              <w:t>2916</w:t>
+            </w:r>
+          </w:p>
+        </w:tc>
+        <w:tc>
+          <w:tcPr>
+            <w:tcW w:type="dxa" w:w="6192"/>
+            <w:vAlign w:val="center"/>
+            <w:shd w:fill="FFFFFF"/>
+            <w:tcMar>
+              <w:top w:w="90" w:type="dxa"/>
+              <w:left w:w="90" w:type="dxa"/>
+              <w:bottom w:w="90" w:type="dxa"/>
+              <w:right w:w="90" w:type="dxa"/>
+            </w:tcMar>
+            <w:tcBorders>
+              <w:top w:val="single" w:sz="4" w:color="D9D9D9"/>
+              <w:left w:val="single" w:sz="4" w:color="D9D9D9"/>
+              <w:bottom w:val="single" w:sz="4" w:color="D9D9D9"/>
+              <w:right w:val="single" w:sz="4" w:color="D9D9D9"/>
+            </w:tcBorders>
+          </w:tcPr>
+          <w:p>
+            <w:pPr>
+              <w:spacing w:after="40" w:line="259" w:lineRule="auto"/>
+            </w:pPr>
+            <w:r>
+              <w:rPr>
+                <w:b w:val="0"/>
+                <w:color w:val="000000"/>
+                <w:sz w:val="20"/>
+              </w:rPr>
+              <w:t>0</w:t>
+            </w:r>
+          </w:p>
+        </w:tc>
+      </w:tr>
+      <w:tr>
+        <w:trPr>
+          <w:cantSplit/>
+        </w:trPr>
+        <w:tc>
+          <w:tcPr>
+            <w:tcW w:type="dxa" w:w="2016"/>
+            <w:vAlign w:val="center"/>
+            <w:shd w:fill="F0F5F5"/>
+            <w:tcMar>
+              <w:top w:w="90" w:type="dxa"/>
+              <w:left w:w="90" w:type="dxa"/>
+              <w:bottom w:w="90" w:type="dxa"/>
+              <w:right w:w="90" w:type="dxa"/>
+            </w:tcMar>
+            <w:tcBorders>
+              <w:top w:val="single" w:sz="4" w:color="D9D9D9"/>
+              <w:left w:val="single" w:sz="4" w:color="D9D9D9"/>
+              <w:bottom w:val="single" w:sz="4" w:color="D9D9D9"/>
+              <w:right w:val="single" w:sz="4" w:color="D9D9D9"/>
+            </w:tcBorders>
+          </w:tcPr>
+          <w:p>
+            <w:pPr>
+              <w:spacing w:after="40" w:line="259" w:lineRule="auto"/>
+            </w:pPr>
+            <w:r>
+              <w:rPr>
+                <w:b w:val="0"/>
+                <w:color w:val="000000"/>
+                <w:sz w:val="20"/>
+              </w:rPr>
+              <w:t>24 mm</w:t>
+            </w:r>
+          </w:p>
+        </w:tc>
+        <w:tc>
+          <w:tcPr>
+            <w:tcW w:type="dxa" w:w="1728"/>
+            <w:vAlign w:val="center"/>
+            <w:shd w:fill="F0F5F5"/>
+            <w:tcMar>
+              <w:top w:w="90" w:type="dxa"/>
+              <w:left w:w="90" w:type="dxa"/>
+              <w:bottom w:w="90" w:type="dxa"/>
+              <w:right w:w="90" w:type="dxa"/>
+            </w:tcMar>
+            <w:tcBorders>
+              <w:top w:val="single" w:sz="4" w:color="D9D9D9"/>
+              <w:left w:val="single" w:sz="4" w:color="D9D9D9"/>
+              <w:bottom w:val="single" w:sz="4" w:color="D9D9D9"/>
+              <w:right w:val="single" w:sz="4" w:color="D9D9D9"/>
+            </w:tcBorders>
+          </w:tcPr>
+          <w:p>
+            <w:pPr>
+              <w:spacing w:after="40" w:line="259" w:lineRule="auto"/>
+            </w:pPr>
+            <w:r>
+              <w:rPr>
+                <w:b w:val="0"/>
+                <w:color w:val="000000"/>
+                <w:sz w:val="20"/>
+              </w:rPr>
+              <w:t>2916</w:t>
+            </w:r>
+          </w:p>
+        </w:tc>
+        <w:tc>
+          <w:tcPr>
+            <w:tcW w:type="dxa" w:w="6192"/>
+            <w:vAlign w:val="center"/>
+            <w:shd w:fill="F0F5F5"/>
+            <w:tcMar>
+              <w:top w:w="90" w:type="dxa"/>
+              <w:left w:w="90" w:type="dxa"/>
+              <w:bottom w:w="90" w:type="dxa"/>
+              <w:right w:w="90" w:type="dxa"/>
+            </w:tcMar>
+            <w:tcBorders>
+              <w:top w:val="single" w:sz="4" w:color="D9D9D9"/>
+              <w:left w:val="single" w:sz="4" w:color="D9D9D9"/>
+              <w:bottom w:val="single" w:sz="4" w:color="D9D9D9"/>
+              <w:right w:val="single" w:sz="4" w:color="D9D9D9"/>
+            </w:tcBorders>
+          </w:tcPr>
+          <w:p>
+            <w:pPr>
+              <w:spacing w:after="40" w:line="259" w:lineRule="auto"/>
+            </w:pPr>
+            <w:r>
+              <w:rPr>
+                <w:b w:val="0"/>
+                <w:color w:val="000000"/>
+                <w:sz w:val="20"/>
+              </w:rPr>
+              <w:t>0</w:t>
+            </w:r>
+          </w:p>
+        </w:tc>
+      </w:tr>
+      <w:tr>
+        <w:trPr>
+          <w:cantSplit/>
+        </w:trPr>
+        <w:tc>
+          <w:tcPr>
+            <w:tcW w:type="dxa" w:w="2016"/>
+            <w:vAlign w:val="center"/>
+            <w:shd w:fill="FFFFFF"/>
+            <w:tcMar>
+              <w:top w:w="90" w:type="dxa"/>
+              <w:left w:w="90" w:type="dxa"/>
+              <w:bottom w:w="90" w:type="dxa"/>
+              <w:right w:w="90" w:type="dxa"/>
+            </w:tcMar>
+            <w:tcBorders>
+              <w:top w:val="single" w:sz="4" w:color="D9D9D9"/>
+              <w:left w:val="single" w:sz="4" w:color="D9D9D9"/>
+              <w:bottom w:val="single" w:sz="4" w:color="D9D9D9"/>
+              <w:right w:val="single" w:sz="4" w:color="D9D9D9"/>
+            </w:tcBorders>
+          </w:tcPr>
+          <w:p>
+            <w:pPr>
+              <w:spacing w:after="40" w:line="259" w:lineRule="auto"/>
+            </w:pPr>
+            <w:r>
+              <w:rPr>
+                <w:b w:val="0"/>
+                <w:color w:val="000000"/>
+                <w:sz w:val="20"/>
+              </w:rPr>
+              <w:t>32 mm</w:t>
+            </w:r>
+          </w:p>
+        </w:tc>
+        <w:tc>
+          <w:tcPr>
+            <w:tcW w:type="dxa" w:w="1728"/>
+            <w:vAlign w:val="center"/>
+            <w:shd w:fill="FFFFFF"/>
+            <w:tcMar>
+              <w:top w:w="90" w:type="dxa"/>
+              <w:left w:w="90" w:type="dxa"/>
+              <w:bottom w:w="90" w:type="dxa"/>
+              <w:right w:w="90" w:type="dxa"/>
+            </w:tcMar>
+            <w:tcBorders>
+              <w:top w:val="single" w:sz="4" w:color="D9D9D9"/>
+              <w:left w:val="single" w:sz="4" w:color="D9D9D9"/>
+              <w:bottom w:val="single" w:sz="4" w:color="D9D9D9"/>
+              <w:right w:val="single" w:sz="4" w:color="D9D9D9"/>
+            </w:tcBorders>
+          </w:tcPr>
+          <w:p>
+            <w:pPr>
+              <w:spacing w:after="40" w:line="259" w:lineRule="auto"/>
+            </w:pPr>
+            <w:r>
+              <w:rPr>
+                <w:b w:val="0"/>
+                <w:color w:val="000000"/>
+                <w:sz w:val="20"/>
+              </w:rPr>
+              <w:t>2916</w:t>
+            </w:r>
+          </w:p>
+        </w:tc>
+        <w:tc>
+          <w:tcPr>
+            <w:tcW w:type="dxa" w:w="6192"/>
+            <w:vAlign w:val="center"/>
+            <w:shd w:fill="FFFFFF"/>
+            <w:tcMar>
+              <w:top w:w="90" w:type="dxa"/>
+              <w:left w:w="90" w:type="dxa"/>
+              <w:bottom w:w="90" w:type="dxa"/>
+              <w:right w:w="90" w:type="dxa"/>
+            </w:tcMar>
+            <w:tcBorders>
+              <w:top w:val="single" w:sz="4" w:color="D9D9D9"/>
+              <w:left w:val="single" w:sz="4" w:color="D9D9D9"/>
+              <w:bottom w:val="single" w:sz="4" w:color="D9D9D9"/>
+              <w:right w:val="single" w:sz="4" w:color="D9D9D9"/>
+            </w:tcBorders>
+          </w:tcPr>
+          <w:p>
+            <w:pPr>
+              <w:spacing w:after="40" w:line="259" w:lineRule="auto"/>
+            </w:pPr>
+            <w:r>
+              <w:rPr>
+                <w:b w:val="0"/>
+                <w:color w:val="000000"/>
+                <w:sz w:val="20"/>
+              </w:rPr>
+              <w:t>0</w:t>
+            </w:r>
+          </w:p>
+        </w:tc>
+      </w:tr>
+    </w:tbl>
+    <w:p/>
+    <w:p>
+      <w:r>
+        <w:t>The 12 mm zone produced 624 cases with slightly increased pressure. The largest increase in the screened cases was 3.76 percent. A glasses arm that misses a soft patch can lose the intended benefit. The 18, 24 and 32 mm zones had no increases in this finite scenario set; this does not cover every face or glasses shape.</w:t>
+      </w:r>
+    </w:p>
+    <w:p>
+      <w:pPr>
+        <w:keepNext/>
+        <w:jc w:val="center"/>
+      </w:pPr>
+      <w:r>
+        <w:drawing>
+          <wp:inline xmlns:a="http://schemas.openxmlformats.org/drawingml/2006/main" xmlns:pic="http://schemas.openxmlformats.org/drawingml/2006/picture">
+            <wp:extent cx="5989320" cy="2341280"/>
+            <wp:docPr id="28" name="Picture 28" descr="Left: selected pressure calculations show how an assumed stiffer cover can reduce the benefit of a soft insert. Right: a steady-airflow illustration shows sensitivity to an open gap. Neither plot is measured comfort, sound attenuation or ANC."/>
+            <wp:cNvGraphicFramePr>
+              <a:graphicFrameLocks noChangeAspect="1"/>
+            </wp:cNvGraphicFramePr>
+            <a:graphic>
+              <a:graphicData uri="http://schemas.openxmlformats.org/drawingml/2006/picture">
+                <pic:pic>
+                  <pic:nvPicPr>
+                    <pic:cNvPr id="0" name="V20_screens.png"/>
+                    <pic:cNvPicPr/>
+                  </pic:nvPicPr>
+                  <pic:blipFill>
+                    <a:blip r:embed="rId61"/>
+                    <a:stretch>
+                      <a:fillRect/>
+                    </a:stretch>
+                  </pic:blipFill>
+                  <pic:spPr>
+                    <a:xfrm>
+                      <a:off x="0" y="0"/>
+                      <a:ext cx="5989320" cy="2341280"/>
+                    </a:xfrm>
+                    <a:prstGeom prst="rect"/>
+                  </pic:spPr>
+                </pic:pic>
+              </a:graphicData>
+            </a:graphic>
+          </wp:inline>
+        </w:drawing>
+      </w:r>
+    </w:p>
+    <w:p>
+      <w:pPr>
+        <w:pStyle w:val="Caption"/>
+        <w:spacing w:after="200"/>
+      </w:pPr>
+      <w:r>
+        <w:t>Left: selected pressure calculations show how an assumed stiffer cover can reduce the benefit of a soft insert. Right: a steady-airflow illustration shows sensitivity to an open gap. Neither plot is measured comfort, sound attenuation or ANC.</w:t>
+      </w:r>
+    </w:p>
+    <w:p>
+      <w:r>
+        <w:t>438 cases exceeded our chosen 40 percent compression screen and are flagged, not accepted as reliable high-compression predictions. The remaining 11,226 cases are still conditional calculations. No percentage here is a probability that a product will work.</w:t>
+      </w:r>
+    </w:p>
+    <w:p>
+      <w:r>
+        <w:t>Twelve selected rows were checked by a separately written scalar calculation with exact ellipse-strip areas. All stayed within the chosen 1 percent comparison. Force balance and a uniform-pressure reference also passed. These checks support the implementation, not the realism of its assumed material law.</w:t>
+      </w:r>
+    </w:p>
+    <w:p>
+      <w:r>
+        <w:br w:type="page"/>
+      </w:r>
+    </w:p>
+    <w:p>
+      <w:pPr>
+        <w:pStyle w:val="Heading1"/>
+      </w:pPr>
+      <w:r>
+        <w:t>V20 Headphone checks and remaining risks</w:t>
+      </w:r>
+    </w:p>
+    <w:p>
+      <w:r>
+        <w:t>All eight saved V19 higher-order joint solutions passed a fresh equation reassembly, file hash, force-balance and saved-array audit. This repeats the same model rather than using an independent physical experiment or a different joint solver. The original V19 assumptions, failed routes and limited stress sampling still apply.</w:t>
+      </w:r>
+    </w:p>
+    <w:p>
+      <w:pPr>
+        <w:keepNext/>
+        <w:jc w:val="center"/>
+      </w:pPr>
+      <w:r>
+        <w:drawing>
+          <wp:inline xmlns:a="http://schemas.openxmlformats.org/drawingml/2006/main" xmlns:pic="http://schemas.openxmlformats.org/drawingml/2006/picture">
+            <wp:extent cx="5989320" cy="2229180"/>
+            <wp:docPr id="29" name="Picture 29" descr="V19 geometry with new assumed friction, preload and tolerance combinations. Negative values identify scenarios that need a controlled setting or a better fit. Counts are not reliability statistics."/>
+            <wp:cNvGraphicFramePr>
+              <a:graphicFrameLocks noChangeAspect="1"/>
+            </wp:cNvGraphicFramePr>
+            <a:graphic>
+              <a:graphicData uri="http://schemas.openxmlformats.org/drawingml/2006/picture">
+                <pic:pic>
+                  <pic:nvPicPr>
+                    <pic:cNvPr id="0" name="V20_mechanics.png"/>
+                    <pic:cNvPicPr/>
+                  </pic:nvPicPr>
+                  <pic:blipFill>
+                    <a:blip r:embed="rId62"/>
+                    <a:stretch>
+                      <a:fillRect/>
+                    </a:stretch>
+                  </pic:blipFill>
+                  <pic:spPr>
+                    <a:xfrm>
+                      <a:off x="0" y="0"/>
+                      <a:ext cx="5989320" cy="2229180"/>
+                    </a:xfrm>
+                    <a:prstGeom prst="rect"/>
+                  </pic:spPr>
+                </pic:pic>
+              </a:graphicData>
+            </a:graphic>
+          </wp:inline>
+        </w:drawing>
+      </w:r>
+    </w:p>
+    <w:p>
+      <w:pPr>
+        <w:pStyle w:val="Caption"/>
+        <w:spacing w:after="200"/>
+      </w:pPr>
+      <w:r>
+        <w:t>V19 geometry with new assumed friction, preload and tolerance combinations. Negative values identify scenarios that need a controlled setting or a better fit. Counts are not reliability statistics.</w:t>
+      </w:r>
+    </w:p>
+    <w:p>
+      <w:r>
+        <w:t>5 of 36 assumed hinge combinations had a negative holding margin. 33 of 54 assumed fit combinations used up the available clearance. We therefore recommend a bench hinge and a pin fit sample before ordering a complete headset.</w:t>
+      </w:r>
+    </w:p>
+    <w:p>
+      <w:r>
+        <w:t>The prior proposed clearance allocation still leaves 0.06 mm radial margin if its tight assumptions are achieved. That is a requested prototype condition, not evidence that a printer or supplier can achieve it. Measure the finished bore, pin and alignment before assembly. The proposed hinge torque needs direct measurement after locking the nuts.</w:t>
+      </w:r>
+    </w:p>
+    <w:p>
+      <w:r>
+        <w:t>Full worn contact, calibrated foam and cover behaviour, incoming sound reduction, outgoing music leakage, ANC, heat, fatigue and durability remain open. Replacing missing material curves or mounting dimensions with assumed numbers would not finish or validate those models. Native editable Fusion files remain V10; current headset geometry remains V19 STEP.</w:t>
+      </w:r>
+    </w:p>
+    <w:p>
+      <w:r>
+        <w:br w:type="page"/>
+      </w:r>
+    </w:p>
+    <w:p>
+      <w:pPr>
+        <w:pStyle w:val="Heading1"/>
+      </w:pPr>
+      <w:r>
+        <w:t>V20 What to buy for the first prototypes</w:t>
+      </w:r>
+    </w:p>
+    <w:p>
+      <w:r>
+        <w:t>Recommendation: proceed with inexpensive learning samples, not a batch of finished headphones or production tooling. Computer checks have narrowed some choices and found failures. We cannot put a credible success percentage on the first sample.</w:t>
+      </w:r>
+    </w:p>
+    <w:tbl>
+      <w:tblPr>
+        <w:tblW w:type="auto" w:w="0"/>
+        <w:jc w:val="center"/>
+        <w:tblLayout w:type="fixed"/>
+        <w:tblLook w:firstColumn="1" w:firstRow="1" w:lastColumn="0" w:lastRow="0" w:noHBand="0" w:noVBand="1" w:val="04A0"/>
+      </w:tblPr>
+      <w:tblGrid>
+        <w:gridCol w:w="2448"/>
+        <w:gridCol w:w="7488"/>
+      </w:tblGrid>
+      <w:tr>
+        <w:trPr>
+          <w:tblHeader/>
+          <w:cantSplit/>
+        </w:trPr>
+        <w:tc>
+          <w:tcPr>
+            <w:tcW w:type="dxa" w:w="2448"/>
+            <w:vAlign w:val="center"/>
+            <w:shd w:fill="203E4B"/>
+            <w:tcMar>
+              <w:top w:w="90" w:type="dxa"/>
+              <w:left w:w="90" w:type="dxa"/>
+              <w:bottom w:w="90" w:type="dxa"/>
+              <w:right w:w="90" w:type="dxa"/>
+            </w:tcMar>
+            <w:tcBorders>
+              <w:top w:val="single" w:sz="4" w:color="D9D9D9"/>
+              <w:left w:val="single" w:sz="4" w:color="D9D9D9"/>
+              <w:bottom w:val="single" w:sz="4" w:color="D9D9D9"/>
+              <w:right w:val="single" w:sz="4" w:color="D9D9D9"/>
+            </w:tcBorders>
+          </w:tcPr>
+          <w:p>
+            <w:pPr>
+              <w:spacing w:after="40" w:line="259" w:lineRule="auto"/>
+            </w:pPr>
+            <w:r>
+              <w:rPr>
+                <w:b/>
+                <w:color w:val="FFFFFF"/>
+                <w:sz w:val="20"/>
+              </w:rPr>
+              <w:t>First purchase or sample</w:t>
+            </w:r>
+          </w:p>
+        </w:tc>
+        <w:tc>
+          <w:tcPr>
+            <w:tcW w:type="dxa" w:w="7488"/>
+            <w:vAlign w:val="center"/>
+            <w:shd w:fill="203E4B"/>
+            <w:tcMar>
+              <w:top w:w="90" w:type="dxa"/>
+              <w:left w:w="90" w:type="dxa"/>
+              <w:bottom w:w="90" w:type="dxa"/>
+              <w:right w:w="90" w:type="dxa"/>
+            </w:tcMar>
+            <w:tcBorders>
+              <w:top w:val="single" w:sz="4" w:color="D9D9D9"/>
+              <w:left w:val="single" w:sz="4" w:color="D9D9D9"/>
+              <w:bottom w:val="single" w:sz="4" w:color="D9D9D9"/>
+              <w:right w:val="single" w:sz="4" w:color="D9D9D9"/>
+            </w:tcBorders>
+          </w:tcPr>
+          <w:p>
+            <w:pPr>
+              <w:spacing w:after="40" w:line="259" w:lineRule="auto"/>
+            </w:pPr>
+            <w:r>
+              <w:rPr>
+                <w:b/>
+                <w:color w:val="FFFFFF"/>
+                <w:sz w:val="20"/>
+              </w:rPr>
+              <w:t>Purpose and condition</w:t>
+            </w:r>
+          </w:p>
+        </w:tc>
+      </w:tr>
+      <w:tr>
+        <w:trPr>
+          <w:cantSplit/>
+        </w:trPr>
+        <w:tc>
+          <w:tcPr>
+            <w:tcW w:type="dxa" w:w="2448"/>
+            <w:vAlign w:val="center"/>
+            <w:shd w:fill="F0F5F5"/>
+            <w:tcMar>
+              <w:top w:w="90" w:type="dxa"/>
+              <w:left w:w="90" w:type="dxa"/>
+              <w:bottom w:w="90" w:type="dxa"/>
+              <w:right w:w="90" w:type="dxa"/>
+            </w:tcMar>
+            <w:tcBorders>
+              <w:top w:val="single" w:sz="4" w:color="D9D9D9"/>
+              <w:left w:val="single" w:sz="4" w:color="D9D9D9"/>
+              <w:bottom w:val="single" w:sz="4" w:color="D9D9D9"/>
+              <w:right w:val="single" w:sz="4" w:color="D9D9D9"/>
+            </w:tcBorders>
+          </w:tcPr>
+          <w:p>
+            <w:pPr>
+              <w:spacing w:after="40" w:line="259" w:lineRule="auto"/>
+            </w:pPr>
+            <w:r>
+              <w:rPr>
+                <w:b w:val="0"/>
+                <w:color w:val="000000"/>
+                <w:sz w:val="20"/>
+              </w:rPr>
+              <w:t>Material coupons</w:t>
+            </w:r>
+          </w:p>
+        </w:tc>
+        <w:tc>
+          <w:tcPr>
+            <w:tcW w:type="dxa" w:w="7488"/>
+            <w:vAlign w:val="center"/>
+            <w:shd w:fill="F0F5F5"/>
+            <w:tcMar>
+              <w:top w:w="90" w:type="dxa"/>
+              <w:left w:w="90" w:type="dxa"/>
+              <w:bottom w:w="90" w:type="dxa"/>
+              <w:right w:w="90" w:type="dxa"/>
+            </w:tcMar>
+            <w:tcBorders>
+              <w:top w:val="single" w:sz="4" w:color="D9D9D9"/>
+              <w:left w:val="single" w:sz="4" w:color="D9D9D9"/>
+              <w:bottom w:val="single" w:sz="4" w:color="D9D9D9"/>
+              <w:right w:val="single" w:sz="4" w:color="D9D9D9"/>
+            </w:tcBorders>
+          </w:tcPr>
+          <w:p>
+            <w:pPr>
+              <w:spacing w:after="40" w:line="259" w:lineRule="auto"/>
+            </w:pPr>
+            <w:r>
+              <w:rPr>
+                <w:b w:val="0"/>
+                <w:color w:val="000000"/>
+                <w:sz w:val="20"/>
+              </w:rPr>
+              <w:t>Small traceable foam and cover pieces with grade and lot details. Compare at least two foam stiffnesses and two covers. Measure compression and recovery before using a fitted material law.</w:t>
+            </w:r>
+          </w:p>
+        </w:tc>
+      </w:tr>
+      <w:tr>
+        <w:trPr>
+          <w:cantSplit/>
+        </w:trPr>
+        <w:tc>
+          <w:tcPr>
+            <w:tcW w:type="dxa" w:w="2448"/>
+            <w:vAlign w:val="center"/>
+            <w:shd w:fill="FFFFFF"/>
+            <w:tcMar>
+              <w:top w:w="90" w:type="dxa"/>
+              <w:left w:w="90" w:type="dxa"/>
+              <w:bottom w:w="90" w:type="dxa"/>
+              <w:right w:w="90" w:type="dxa"/>
+            </w:tcMar>
+            <w:tcBorders>
+              <w:top w:val="single" w:sz="4" w:color="D9D9D9"/>
+              <w:left w:val="single" w:sz="4" w:color="D9D9D9"/>
+              <w:bottom w:val="single" w:sz="4" w:color="D9D9D9"/>
+              <w:right w:val="single" w:sz="4" w:color="D9D9D9"/>
+            </w:tcBorders>
+          </w:tcPr>
+          <w:p>
+            <w:pPr>
+              <w:spacing w:after="40" w:line="259" w:lineRule="auto"/>
+            </w:pPr>
+            <w:r>
+              <w:rPr>
+                <w:b w:val="0"/>
+                <w:color w:val="000000"/>
+                <w:sz w:val="20"/>
+              </w:rPr>
+              <w:t>Pad comparison set</w:t>
+            </w:r>
+          </w:p>
+        </w:tc>
+        <w:tc>
+          <w:tcPr>
+            <w:tcW w:type="dxa" w:w="7488"/>
+            <w:vAlign w:val="center"/>
+            <w:shd w:fill="FFFFFF"/>
+            <w:tcMar>
+              <w:top w:w="90" w:type="dxa"/>
+              <w:left w:w="90" w:type="dxa"/>
+              <w:bottom w:w="90" w:type="dxa"/>
+              <w:right w:w="90" w:type="dxa"/>
+            </w:tcMar>
+            <w:tcBorders>
+              <w:top w:val="single" w:sz="4" w:color="D9D9D9"/>
+              <w:left w:val="single" w:sz="4" w:color="D9D9D9"/>
+              <w:bottom w:val="single" w:sz="4" w:color="D9D9D9"/>
+              <w:right w:val="single" w:sz="4" w:color="D9D9D9"/>
+            </w:tcBorders>
+          </w:tcPr>
+          <w:p>
+            <w:pPr>
+              <w:spacing w:after="40" w:line="259" w:lineRule="auto"/>
+            </w:pPr>
+            <w:r>
+              <w:rPr>
+                <w:b w:val="0"/>
+                <w:color w:val="000000"/>
+                <w:sz w:val="20"/>
+              </w:rPr>
+              <w:t>Uniform and soft-zone bodies with the same outside size and cover. Start with the 18 mm and broader 32 mm options. Keep an original or correctly labelled compatible pad as the baseline.</w:t>
+            </w:r>
+          </w:p>
+        </w:tc>
+      </w:tr>
+      <w:tr>
+        <w:trPr>
+          <w:cantSplit/>
+        </w:trPr>
+        <w:tc>
+          <w:tcPr>
+            <w:tcW w:type="dxa" w:w="2448"/>
+            <w:vAlign w:val="center"/>
+            <w:shd w:fill="F0F5F5"/>
+            <w:tcMar>
+              <w:top w:w="90" w:type="dxa"/>
+              <w:left w:w="90" w:type="dxa"/>
+              <w:bottom w:w="90" w:type="dxa"/>
+              <w:right w:w="90" w:type="dxa"/>
+            </w:tcMar>
+            <w:tcBorders>
+              <w:top w:val="single" w:sz="4" w:color="D9D9D9"/>
+              <w:left w:val="single" w:sz="4" w:color="D9D9D9"/>
+              <w:bottom w:val="single" w:sz="4" w:color="D9D9D9"/>
+              <w:right w:val="single" w:sz="4" w:color="D9D9D9"/>
+            </w:tcBorders>
+          </w:tcPr>
+          <w:p>
+            <w:pPr>
+              <w:spacing w:after="40" w:line="259" w:lineRule="auto"/>
+            </w:pPr>
+            <w:r>
+              <w:rPr>
+                <w:b w:val="0"/>
+                <w:color w:val="000000"/>
+                <w:sz w:val="20"/>
+              </w:rPr>
+              <w:t>Sony mounting reference</w:t>
+            </w:r>
+          </w:p>
+        </w:tc>
+        <w:tc>
+          <w:tcPr>
+            <w:tcW w:type="dxa" w:w="7488"/>
+            <w:vAlign w:val="center"/>
+            <w:shd w:fill="F0F5F5"/>
+            <w:tcMar>
+              <w:top w:w="90" w:type="dxa"/>
+              <w:left w:w="90" w:type="dxa"/>
+              <w:bottom w:w="90" w:type="dxa"/>
+              <w:right w:w="90" w:type="dxa"/>
+            </w:tcMar>
+            <w:tcBorders>
+              <w:top w:val="single" w:sz="4" w:color="D9D9D9"/>
+              <w:left w:val="single" w:sz="4" w:color="D9D9D9"/>
+              <w:bottom w:val="single" w:sz="4" w:color="D9D9D9"/>
+              <w:right w:val="single" w:sz="4" w:color="D9D9D9"/>
+            </w:tcBorders>
+          </w:tcPr>
+          <w:p>
+            <w:pPr>
+              <w:spacing w:after="40" w:line="259" w:lineRule="auto"/>
+            </w:pPr>
+            <w:r>
+              <w:rPr>
+                <w:b w:val="0"/>
+                <w:color w:val="000000"/>
+                <w:sz w:val="20"/>
+              </w:rPr>
+              <w:t>One model-specific replacement pad or a supplier-held WH CH720N reference. A supplier can measure its skirt and groove, so the user does not have to measure now. A claimed-compatible listing is not a verified fit.</w:t>
+            </w:r>
+          </w:p>
+        </w:tc>
+      </w:tr>
+      <w:tr>
+        <w:trPr>
+          <w:cantSplit/>
+        </w:trPr>
+        <w:tc>
+          <w:tcPr>
+            <w:tcW w:type="dxa" w:w="2448"/>
+            <w:vAlign w:val="center"/>
+            <w:shd w:fill="FFFFFF"/>
+            <w:tcMar>
+              <w:top w:w="90" w:type="dxa"/>
+              <w:left w:w="90" w:type="dxa"/>
+              <w:bottom w:w="90" w:type="dxa"/>
+              <w:right w:w="90" w:type="dxa"/>
+            </w:tcMar>
+            <w:tcBorders>
+              <w:top w:val="single" w:sz="4" w:color="D9D9D9"/>
+              <w:left w:val="single" w:sz="4" w:color="D9D9D9"/>
+              <w:bottom w:val="single" w:sz="4" w:color="D9D9D9"/>
+              <w:right w:val="single" w:sz="4" w:color="D9D9D9"/>
+            </w:tcBorders>
+          </w:tcPr>
+          <w:p>
+            <w:pPr>
+              <w:spacing w:after="40" w:line="259" w:lineRule="auto"/>
+            </w:pPr>
+            <w:r>
+              <w:rPr>
+                <w:b w:val="0"/>
+                <w:color w:val="000000"/>
+                <w:sz w:val="20"/>
+              </w:rPr>
+              <w:t>One bench hinge</w:t>
+            </w:r>
+          </w:p>
+        </w:tc>
+        <w:tc>
+          <w:tcPr>
+            <w:tcW w:type="dxa" w:w="7488"/>
+            <w:vAlign w:val="center"/>
+            <w:shd w:fill="FFFFFF"/>
+            <w:tcMar>
+              <w:top w:w="90" w:type="dxa"/>
+              <w:left w:w="90" w:type="dxa"/>
+              <w:bottom w:w="90" w:type="dxa"/>
+              <w:right w:w="90" w:type="dxa"/>
+            </w:tcMar>
+            <w:tcBorders>
+              <w:top w:val="single" w:sz="4" w:color="D9D9D9"/>
+              <w:left w:val="single" w:sz="4" w:color="D9D9D9"/>
+              <w:bottom w:val="single" w:sz="4" w:color="D9D9D9"/>
+              <w:right w:val="single" w:sz="4" w:color="D9D9D9"/>
+            </w:tcBorders>
+          </w:tcPr>
+          <w:p>
+            <w:pPr>
+              <w:spacing w:after="40" w:line="259" w:lineRule="auto"/>
+            </w:pPr>
+            <w:r>
+              <w:rPr>
+                <w:b w:val="0"/>
+                <w:color w:val="000000"/>
+                <w:sz w:val="20"/>
+              </w:rPr>
+              <w:t>Use the V19 pin and joint proposal for supplier review. Check pin fit, tool access, spring setting, torque and nut locking before printing a full assembly.</w:t>
+            </w:r>
+          </w:p>
+        </w:tc>
+      </w:tr>
+      <w:tr>
+        <w:trPr>
+          <w:cantSplit/>
+        </w:trPr>
+        <w:tc>
+          <w:tcPr>
+            <w:tcW w:type="dxa" w:w="2448"/>
+            <w:vAlign w:val="center"/>
+            <w:shd w:fill="F0F5F5"/>
+            <w:tcMar>
+              <w:top w:w="90" w:type="dxa"/>
+              <w:left w:w="90" w:type="dxa"/>
+              <w:bottom w:w="90" w:type="dxa"/>
+              <w:right w:w="90" w:type="dxa"/>
+            </w:tcMar>
+            <w:tcBorders>
+              <w:top w:val="single" w:sz="4" w:color="D9D9D9"/>
+              <w:left w:val="single" w:sz="4" w:color="D9D9D9"/>
+              <w:bottom w:val="single" w:sz="4" w:color="D9D9D9"/>
+              <w:right w:val="single" w:sz="4" w:color="D9D9D9"/>
+            </w:tcBorders>
+          </w:tcPr>
+          <w:p>
+            <w:pPr>
+              <w:spacing w:after="40" w:line="259" w:lineRule="auto"/>
+            </w:pPr>
+            <w:r>
+              <w:rPr>
+                <w:b w:val="0"/>
+                <w:color w:val="000000"/>
+                <w:sz w:val="20"/>
+              </w:rPr>
+              <w:t>Adult fixture prototype later</w:t>
+            </w:r>
+          </w:p>
+        </w:tc>
+        <w:tc>
+          <w:tcPr>
+            <w:tcW w:type="dxa" w:w="7488"/>
+            <w:vAlign w:val="center"/>
+            <w:shd w:fill="F0F5F5"/>
+            <w:tcMar>
+              <w:top w:w="90" w:type="dxa"/>
+              <w:left w:w="90" w:type="dxa"/>
+              <w:bottom w:w="90" w:type="dxa"/>
+              <w:right w:w="90" w:type="dxa"/>
+            </w:tcMar>
+            <w:tcBorders>
+              <w:top w:val="single" w:sz="4" w:color="D9D9D9"/>
+              <w:left w:val="single" w:sz="4" w:color="D9D9D9"/>
+              <w:bottom w:val="single" w:sz="4" w:color="D9D9D9"/>
+              <w:right w:val="single" w:sz="4" w:color="D9D9D9"/>
+            </w:tcBorders>
+          </w:tcPr>
+          <w:p>
+            <w:pPr>
+              <w:spacing w:after="40" w:line="259" w:lineRule="auto"/>
+            </w:pPr>
+            <w:r>
+              <w:rPr>
+                <w:b w:val="0"/>
+                <w:color w:val="000000"/>
+                <w:sz w:val="20"/>
+              </w:rPr>
+              <w:t>After the hinge, materials and pad attachment work, build one adult sample. Check contact, noise, heat and handling before voluntary wearer trials or child sizing trials.</w:t>
+            </w:r>
+          </w:p>
+        </w:tc>
+      </w:tr>
+    </w:tbl>
+    <w:p/>
+    <w:p>
+      <w:r>
+        <w:t>Do not order custom Sony mounting tooling from these body STEP files. Do not order the rejected exact-thread experiment. No final material winner or cheapest-price result has been established; quotations and sample quality are still needed.</w:t>
+      </w:r>
+    </w:p>
+    <w:p>
+      <w:r>
+        <w:t>Grant wording we can support: We developed six adjustable headphone concepts, documented sampled folding checks and conditional joint calculations, and built three reference cushion designs using published aftermarket dimensions. We are seeking support to make samples, measure the missing inputs and test the proposed comfort and sealing benefits.</w:t>
+      </w:r>
+    </w:p>
+    <w:p>
+      <w:r>
+        <w:t>Claims we cannot support yet include proven benefit for autistic users, clinically tested comfort, a verified Sony fit, zero leakage, a quantified chance of success, a certified noise rating or superiority over other headphones. No funding application was submitted.</w:t>
+      </w:r>
+    </w:p>
+    <w:p>
+      <w:r>
+        <w:br w:type="page"/>
+      </w:r>
+    </w:p>
+    <w:p>
+      <w:pPr>
+        <w:pStyle w:val="Heading1"/>
+      </w:pPr>
+      <w:r>
+        <w:t>V20 Source evidence and audit trail</w:t>
+      </w:r>
+    </w:p>
+    <w:p>
+      <w:r>
+        <w:t>The screenshots below record the sources checked on 21 October 2026. They support dimensions and the mounting approach, not our product performance. Screenshots and attractive CAD pictures are supporting illustrations; raw files, assumptions and checks carry the numerical evidence.</w:t>
+      </w:r>
+    </w:p>
+    <w:p>
+      <w:pPr>
+        <w:keepNext/>
+      </w:pPr>
+      <w:r>
+        <w:drawing>
+          <wp:inline xmlns:a="http://schemas.openxmlformats.org/drawingml/2006/main" xmlns:pic="http://schemas.openxmlformats.org/drawingml/2006/picture">
+            <wp:extent cx="4389120" cy="2470398"/>
+            <wp:docPr id="30" name="Picture 30" descr="Brainwavz sizing panel for its compatible aftermarket pad. Not Sony OEM mounting metrology."/>
+            <wp:cNvGraphicFramePr>
+              <a:graphicFrameLocks noChangeAspect="1"/>
+            </wp:cNvGraphicFramePr>
+            <a:graphic>
+              <a:graphicData uri="http://schemas.openxmlformats.org/drawingml/2006/picture">
+                <pic:pic>
+                  <pic:nvPicPr>
+                    <pic:cNvPr id="0" name="Brainwavz_dimensions_source.jpg"/>
+                    <pic:cNvPicPr/>
+                  </pic:nvPicPr>
+                  <pic:blipFill>
+                    <a:blip r:embed="rId63"/>
+                    <a:stretch>
+                      <a:fillRect/>
+                    </a:stretch>
+                  </pic:blipFill>
+                  <pic:spPr>
+                    <a:xfrm>
+                      <a:off x="0" y="0"/>
+                      <a:ext cx="4389120" cy="2470398"/>
+                    </a:xfrm>
+                    <a:prstGeom prst="rect"/>
+                  </pic:spPr>
+                </pic:pic>
+              </a:graphicData>
+            </a:graphic>
+          </wp:inline>
+        </w:drawing>
+      </w:r>
+    </w:p>
+    <w:p>
+      <w:pPr>
+        <w:pStyle w:val="Caption"/>
+      </w:pPr>
+      <w:r>
+        <w:t>Brainwavz sizing panel for its compatible aftermarket pad. Not Sony OEM mounting metrology.</w:t>
+      </w:r>
+    </w:p>
+    <w:p>
+      <w:pPr>
+        <w:keepNext/>
+      </w:pPr>
+      <w:r>
+        <w:drawing>
+          <wp:inline xmlns:a="http://schemas.openxmlformats.org/drawingml/2006/main" xmlns:pic="http://schemas.openxmlformats.org/drawingml/2006/picture">
+            <wp:extent cx="5212080" cy="2933598"/>
+            <wp:docPr id="31" name="Picture 31" descr="Sony instructions explicitly identify WH CH720N alignment features. No scale or groove dimensions are given."/>
+            <wp:cNvGraphicFramePr>
+              <a:graphicFrameLocks noChangeAspect="1"/>
+            </wp:cNvGraphicFramePr>
+            <a:graphic>
+              <a:graphicData uri="http://schemas.openxmlformats.org/drawingml/2006/picture">
+                <pic:pic>
+                  <pic:nvPicPr>
+                    <pic:cNvPr id="0" name="Sony_mount_source.jpg"/>
+                    <pic:cNvPicPr/>
+                  </pic:nvPicPr>
+                  <pic:blipFill>
+                    <a:blip r:embed="rId64"/>
+                    <a:stretch>
+                      <a:fillRect/>
+                    </a:stretch>
+                  </pic:blipFill>
+                  <pic:spPr>
+                    <a:xfrm>
+                      <a:off x="0" y="0"/>
+                      <a:ext cx="5212080" cy="2933598"/>
+                    </a:xfrm>
+                    <a:prstGeom prst="rect"/>
+                  </pic:spPr>
+                </pic:pic>
+              </a:graphicData>
+            </a:graphic>
+          </wp:inline>
+        </w:drawing>
+      </w:r>
+    </w:p>
+    <w:p>
+      <w:pPr>
+        <w:pStyle w:val="Caption"/>
+      </w:pPr>
+      <w:r>
+        <w:t>Sony instructions explicitly identify WH CH720N alignment features. No scale or groove dimensions are given.</w:t>
+      </w:r>
+    </w:p>
+    <w:p>
+      <w:hyperlink r:id="rId65">
+        <w:r>
+          <w:rPr>
+            <w:color w:val="24536A"/>
+          </w:rPr>
+          <w:t>Brainwavz compatible pad dimensions and model list</w:t>
+        </w:r>
+      </w:hyperlink>
+    </w:p>
+    <w:p>
+      <w:hyperlink r:id="rId23">
+        <w:r>
+          <w:rPr>
+            <w:color w:val="24536A"/>
+          </w:rPr>
+          <w:t>Sony replacement instructions for the WH CH series</w:t>
+        </w:r>
+      </w:hyperlink>
+    </w:p>
+    <w:p>
+      <w:r>
+        <w:t>Saved evidence: engineering-v20-results contains internet_sources.json, design_parameters.json, CAD_verification.json, contact_summary.json, contact_controls.json, verification.json, saved_audit_rerun.json, scenario CSVs and the source screenshots. Source scripts are v20_preprototype_screen.py, verify_v20_screen.py and build_v20_flex_reference.py. The first ellipse build error is preserved in CAD_build_trials.json.</w:t>
+      </w:r>
+    </w:p>
     <w:sectPr>
       <w:headerReference w:type="default" r:id="rId9"/>
       <w:footerReference w:type="default" r:id="rId10"/>
@@ -29513,7 +31305,7 @@
       <w:rPr>
         <w:sz w:val="16"/>
       </w:rPr>
-      <w:t>SOFTSPACE    |    16 October 2026</w:t>
+      <w:t>SOFTSPACE    |    21 October 2026</w:t>
     </w:r>
   </w:p>
 </w:hdr>

</xml_diff>